<commit_message>
Pin high-resolution logo to top-right header
</commit_message>
<xml_diff>
--- a/templates/shimentox.docx
+++ b/templates/shimentox.docx
@@ -64,87 +64,87 @@
 </file>
 
 <file path=word/header1.xml><?xml version="1.0" encoding="utf-8"?>
-<w:hdr xmlns:wpc="http://schemas.microsoft.com/office/word/2010/wordprocessingCanvas" xmlns:cx="http://schemas.microsoft.com/office/drawing/2014/chartex" xmlns:cx1="http://schemas.microsoft.com/office/drawing/2015/9/8/chartex" xmlns:cx2="http://schemas.microsoft.com/office/drawing/2015/10/21/chartex" xmlns:cx3="http://schemas.microsoft.com/office/drawing/2016/5/9/chartex" xmlns:cx4="http://schemas.microsoft.com/office/drawing/2016/5/10/chartex" xmlns:cx5="http://schemas.microsoft.com/office/drawing/2016/5/11/chartex" xmlns:cx6="http://schemas.microsoft.com/office/drawing/2016/5/12/chartex" xmlns:cx7="http://schemas.microsoft.com/office/drawing/2016/5/13/chartex" xmlns:cx8="http://schemas.microsoft.com/office/drawing/2016/5/14/chartex" xmlns:mc="http://schemas.openxmlformats.org/markup-compatibility/2006" xmlns:aink="http://schemas.microsoft.com/office/drawing/2016/ink" xmlns:am3d="http://schemas.microsoft.com/office/drawing/2017/model3d" xmlns:o="urn:schemas-microsoft-com:office:office" xmlns:oel="http://schemas.microsoft.com/office/2019/extlst" xmlns:r="http://schemas.openxmlformats.org/officeDocument/2006/relationships" xmlns:m="http://schemas.openxmlformats.org/officeDocument/2006/math" xmlns:v="urn:schemas-microsoft-com:vml" xmlns:wp14="http://schemas.microsoft.com/office/word/2010/wordprocessingDrawing" xmlns:wp="http://schemas.openxmlformats.org/drawingml/2006/wordprocessingDrawing" xmlns:w10="urn:schemas-microsoft-com:office:word" xmlns:w="http://schemas.openxmlformats.org/wordprocessingml/2006/main" xmlns:w14="http://schemas.microsoft.com/office/word/2010/wordml" xmlns:w15="http://schemas.microsoft.com/office/word/2012/wordml" xmlns:w16cex="http://schemas.microsoft.com/office/word/2018/wordml/cex" xmlns:w16cid="http://schemas.microsoft.com/office/word/2016/wordml/cid" xmlns:w16="http://schemas.microsoft.com/office/word/2018/wordml" xmlns:w16du="http://schemas.microsoft.com/office/word/2023/wordml/word16du" xmlns:w16sdtdh="http://schemas.microsoft.com/office/word/2020/wordml/sdtdatahash" xmlns:w16sdtfl="http://schemas.microsoft.com/office/word/2024/wordml/sdtformatlock" xmlns:w16se="http://schemas.microsoft.com/office/word/2015/wordml/symex" xmlns:wpg="http://schemas.microsoft.com/office/word/2010/wordprocessingGroup" xmlns:wpi="http://schemas.microsoft.com/office/word/2010/wordprocessingInk" xmlns:wne="http://schemas.microsoft.com/office/word/2006/wordml" xmlns:wps="http://schemas.microsoft.com/office/word/2010/wordprocessingShape" mc:Ignorable="w14 w15 w16se w16cid w16 w16cex w16sdtdh w16sdtfl w16du wp14">
-  <w:p>
-    <w:pPr>
-      <w:pStyle w:val="Header"/>
-      <w:tabs>
-        <w:tab w:pos="10466" w:val="right"/>
-      </w:tabs>
-      <w:rPr>
-        <w:rFonts w:ascii="Times New Roman" w:hAnsi="Times New Roman" w:cs="Times New Roman"/>
-        <w:b/>
-        <w:sz w:val="28"/>
-        <w:szCs w:val="28"/>
-      </w:rPr>
-    </w:pPr>
-    <w:r>
-      <w:rPr>
-        <w:rFonts w:ascii="Times New Roman" w:hAnsi="Times New Roman" w:cs="Times New Roman"/>
-        <w:b/>
-        <w:sz w:val="28"/>
-        <w:szCs w:val="28"/>
-      </w:rPr>
-      <w:t xml:space="preserve"/>
-    </w:r>
-    <w:r>
-      <w:tab/>
-    </w:r>
-    <w:r>
-      <w:rPr>
-        <w:noProof/>
-      </w:rPr>
-      <w:drawing>
-        <wp:inline distT="0" distB="0" distL="0" distR="0" wp14:anchorId="2DE2E8FD" wp14:editId="7510F1D2">
-          <wp:extent cx="1905000" cy="335280"/>
-          <wp:effectExtent l="0" t="0" r="0" b="7620"/>
-          <wp:docPr id="848381399" name="Picture 1"/>
-          <wp:cNvGraphicFramePr>
-            <a:graphicFrameLocks xmlns:a="http://schemas.openxmlformats.org/drawingml/2006/main" noChangeAspect="1"/>
-          </wp:cNvGraphicFramePr>
-          <a:graphic xmlns:a="http://schemas.openxmlformats.org/drawingml/2006/main">
-            <a:graphicData uri="http://schemas.openxmlformats.org/drawingml/2006/picture">
-              <pic:pic xmlns:pic="http://schemas.openxmlformats.org/drawingml/2006/picture">
-                <pic:nvPicPr>
-                  <pic:cNvPr id="0" name="Picture 1684915597"/>
-                  <pic:cNvPicPr>
-                    <a:picLocks noChangeAspect="1" noChangeArrowheads="1"/>
-                  </pic:cNvPicPr>
-                </pic:nvPicPr>
-                <pic:blipFill>
-                  <a:blip r:embed="rId1">
-                    <a:extLst>
-                      <a:ext uri="{28A0092B-C50C-407E-A947-70E740481C1C}">
-                        <a14:useLocalDpi xmlns:a14="http://schemas.microsoft.com/office/drawing/2010/main" val="0"/>
-                      </a:ext>
-                    </a:extLst>
-                  </a:blip>
-                  <a:srcRect/>
-                  <a:stretch>
-                    <a:fillRect/>
-                  </a:stretch>
-                </pic:blipFill>
-                <pic:spPr bwMode="auto">
-                  <a:xfrm>
-                    <a:off x="0" y="0"/>
-                    <a:ext cx="1905000" cy="335280"/>
-                  </a:xfrm>
-                  <a:prstGeom prst="rect">
-                    <a:avLst/>
-                  </a:prstGeom>
-                  <a:noFill/>
-                  <a:ln>
-                    <a:noFill/>
-                  </a:ln>
-                </pic:spPr>
-              </pic:pic>
-            </a:graphicData>
-          </a:graphic>
-        </wp:inline>
-      </w:drawing>
-    </w:r>
-  </w:p>
-</w:hdr>
+<ns0:hdr xmlns:ns0="http://schemas.openxmlformats.org/wordprocessingml/2006/main" xmlns:ns1="http://schemas.openxmlformats.org/markup-compatibility/2006" xmlns:ns2="http://schemas.microsoft.com/office/word/2010/wordml" xmlns:ns3="http://schemas.openxmlformats.org/drawingml/2006/wordprocessingDrawing" xmlns:ns4="http://schemas.microsoft.com/office/word/2010/wordprocessingDrawing" xmlns:ns5="http://schemas.openxmlformats.org/drawingml/2006/main" xmlns:ns6="http://schemas.openxmlformats.org/drawingml/2006/picture" xmlns:ns7="http://schemas.openxmlformats.org/officeDocument/2006/relationships" xmlns:ns8="http://schemas.microsoft.com/office/drawing/2010/main" ns1:Ignorable="w14 w15 w16se w16cid w16 w16cex w16sdtdh w16sdtfl w16du wp14">
+  <ns0:p ns2:paraId="4A4B744E" ns2:textId="3F5C4C81" ns0:rsidR="00FB200F" ns0:rsidRPr="00FB200F" ns0:rsidRDefault="00C55180" ns0:rsidP="00B53E80">
+    <ns0:pPr>
+      <ns0:pStyle ns0:val="Header"/>
+      <ns0:tabs>
+        <ns0:tab ns0:pos="10466" ns0:val="right"/>
+      </ns0:tabs>
+      <ns0:rPr>
+        <ns0:rFonts ns0:ascii="Times New Roman" ns0:hAnsi="Times New Roman" ns0:cs="Times New Roman"/>
+        <ns0:b/>
+        <ns0:sz ns0:val="28"/>
+        <ns0:szCs ns0:val="28"/>
+      </ns0:rPr>
+    </ns0:pPr>
+    <ns0:r>
+      <ns0:rPr>
+        <ns0:rFonts ns0:ascii="Times New Roman" ns0:hAnsi="Times New Roman" ns0:cs="Times New Roman"/>
+        <ns0:b/>
+        <ns0:sz ns0:val="28"/>
+        <ns0:szCs ns0:val="28"/>
+      </ns0:rPr>
+      <ns0:t xml:space="preserve"/>
+    </ns0:r>
+    <ns0:r>
+      <ns0:tab/>
+    </ns0:r>
+    <ns0:r>
+      <ns0:rPr>
+        <ns0:noProof/>
+      </ns0:rPr>
+      <ns0:drawing>
+        <ns3:inline distT="0" distB="0" distL="0" distR="0" ns4:anchorId="2DE2E8FD" ns4:editId="7510F1D2">
+          <ns3:extent cx="1905000" cy="346970"/>
+          <ns3:effectExtent l="0" t="0" r="0" b="7620"/>
+          <ns3:docPr id="848381399" name="Picture 1"/>
+          <ns3:cNvGraphicFramePr>
+            <ns5:graphicFrameLocks noChangeAspect="1"/>
+          </ns3:cNvGraphicFramePr>
+          <ns5:graphic>
+            <ns5:graphicData uri="http://schemas.openxmlformats.org/drawingml/2006/picture">
+              <ns6:pic>
+                <ns6:nvPicPr>
+                  <ns6:cNvPr id="0" name="Picture 1684915597"/>
+                  <ns6:cNvPicPr>
+                    <ns5:picLocks noChangeAspect="1" noChangeArrowheads="1"/>
+                  </ns6:cNvPicPr>
+                </ns6:nvPicPr>
+                <ns6:blipFill>
+                  <ns5:blip ns7:embed="rId1">
+                    <ns5:extLst>
+                      <ns5:ext uri="{28A0092B-C50C-407E-A947-70E740481C1C}">
+                        <ns8:useLocalDpi val="0"/>
+                      </ns5:ext>
+                    </ns5:extLst>
+                  </ns5:blip>
+                  <ns5:srcRect/>
+                  <ns5:stretch>
+                    <ns5:fillRect/>
+                  </ns5:stretch>
+                </ns6:blipFill>
+                <ns6:spPr bwMode="auto">
+                  <ns5:xfrm>
+                    <ns5:off x="0" y="0"/>
+                    <ns5:ext cx="1905000" cy="346970"/>
+                  </ns5:xfrm>
+                  <ns5:prstGeom prst="rect">
+                    <ns5:avLst/>
+                  </ns5:prstGeom>
+                  <ns5:noFill/>
+                  <ns5:ln>
+                    <ns5:noFill/>
+                  </ns5:ln>
+                </ns6:spPr>
+              </ns6:pic>
+            </ns5:graphicData>
+          </ns5:graphic>
+        </ns3:inline>
+      </ns0:drawing>
+    </ns0:r>
+  </ns0:p>
+</ns0:hdr>
 </file>
 
 <file path=word/numbering.xml><?xml version="1.0" encoding="utf-8"?>

</xml_diff>

<commit_message>
Prepare Resume Formatter for UAT
Improve processing responsiveness and PDF export, embed the high-resolution ShimentoX logo at the top-right, add regression and CI coverage, remove generated cache files, and document the UAT-ready release.
</commit_message>
<xml_diff>
--- a/templates/shimentox.docx
+++ b/templates/shimentox.docx
@@ -64,87 +64,87 @@
 </file>
 
 <file path=word/header1.xml><?xml version="1.0" encoding="utf-8"?>
-<w:hdr xmlns:wpc="http://schemas.microsoft.com/office/word/2010/wordprocessingCanvas" xmlns:cx="http://schemas.microsoft.com/office/drawing/2014/chartex" xmlns:cx1="http://schemas.microsoft.com/office/drawing/2015/9/8/chartex" xmlns:cx2="http://schemas.microsoft.com/office/drawing/2015/10/21/chartex" xmlns:cx3="http://schemas.microsoft.com/office/drawing/2016/5/9/chartex" xmlns:cx4="http://schemas.microsoft.com/office/drawing/2016/5/10/chartex" xmlns:cx5="http://schemas.microsoft.com/office/drawing/2016/5/11/chartex" xmlns:cx6="http://schemas.microsoft.com/office/drawing/2016/5/12/chartex" xmlns:cx7="http://schemas.microsoft.com/office/drawing/2016/5/13/chartex" xmlns:cx8="http://schemas.microsoft.com/office/drawing/2016/5/14/chartex" xmlns:mc="http://schemas.openxmlformats.org/markup-compatibility/2006" xmlns:aink="http://schemas.microsoft.com/office/drawing/2016/ink" xmlns:am3d="http://schemas.microsoft.com/office/drawing/2017/model3d" xmlns:o="urn:schemas-microsoft-com:office:office" xmlns:oel="http://schemas.microsoft.com/office/2019/extlst" xmlns:r="http://schemas.openxmlformats.org/officeDocument/2006/relationships" xmlns:m="http://schemas.openxmlformats.org/officeDocument/2006/math" xmlns:v="urn:schemas-microsoft-com:vml" xmlns:wp14="http://schemas.microsoft.com/office/word/2010/wordprocessingDrawing" xmlns:wp="http://schemas.openxmlformats.org/drawingml/2006/wordprocessingDrawing" xmlns:w10="urn:schemas-microsoft-com:office:word" xmlns:w="http://schemas.openxmlformats.org/wordprocessingml/2006/main" xmlns:w14="http://schemas.microsoft.com/office/word/2010/wordml" xmlns:w15="http://schemas.microsoft.com/office/word/2012/wordml" xmlns:w16cex="http://schemas.microsoft.com/office/word/2018/wordml/cex" xmlns:w16cid="http://schemas.microsoft.com/office/word/2016/wordml/cid" xmlns:w16="http://schemas.microsoft.com/office/word/2018/wordml" xmlns:w16du="http://schemas.microsoft.com/office/word/2023/wordml/word16du" xmlns:w16sdtdh="http://schemas.microsoft.com/office/word/2020/wordml/sdtdatahash" xmlns:w16sdtfl="http://schemas.microsoft.com/office/word/2024/wordml/sdtformatlock" xmlns:w16se="http://schemas.microsoft.com/office/word/2015/wordml/symex" xmlns:wpg="http://schemas.microsoft.com/office/word/2010/wordprocessingGroup" xmlns:wpi="http://schemas.microsoft.com/office/word/2010/wordprocessingInk" xmlns:wne="http://schemas.microsoft.com/office/word/2006/wordml" xmlns:wps="http://schemas.microsoft.com/office/word/2010/wordprocessingShape" mc:Ignorable="w14 w15 w16se w16cid w16 w16cex w16sdtdh w16sdtfl w16du wp14">
-  <w:p>
-    <w:pPr>
-      <w:pStyle w:val="Header"/>
-      <w:tabs>
-        <w:tab w:pos="10466" w:val="right"/>
-      </w:tabs>
-      <w:rPr>
-        <w:rFonts w:ascii="Times New Roman" w:hAnsi="Times New Roman" w:cs="Times New Roman"/>
-        <w:b/>
-        <w:sz w:val="28"/>
-        <w:szCs w:val="28"/>
-      </w:rPr>
-    </w:pPr>
-    <w:r>
-      <w:rPr>
-        <w:rFonts w:ascii="Times New Roman" w:hAnsi="Times New Roman" w:cs="Times New Roman"/>
-        <w:b/>
-        <w:sz w:val="28"/>
-        <w:szCs w:val="28"/>
-      </w:rPr>
-      <w:t xml:space="preserve"/>
-    </w:r>
-    <w:r>
-      <w:tab/>
-    </w:r>
-    <w:r>
-      <w:rPr>
-        <w:noProof/>
-      </w:rPr>
-      <w:drawing>
-        <wp:inline distT="0" distB="0" distL="0" distR="0" wp14:anchorId="2DE2E8FD" wp14:editId="7510F1D2">
-          <wp:extent cx="1905000" cy="335280"/>
-          <wp:effectExtent l="0" t="0" r="0" b="7620"/>
-          <wp:docPr id="848381399" name="Picture 1"/>
-          <wp:cNvGraphicFramePr>
-            <a:graphicFrameLocks xmlns:a="http://schemas.openxmlformats.org/drawingml/2006/main" noChangeAspect="1"/>
-          </wp:cNvGraphicFramePr>
-          <a:graphic xmlns:a="http://schemas.openxmlformats.org/drawingml/2006/main">
-            <a:graphicData uri="http://schemas.openxmlformats.org/drawingml/2006/picture">
-              <pic:pic xmlns:pic="http://schemas.openxmlformats.org/drawingml/2006/picture">
-                <pic:nvPicPr>
-                  <pic:cNvPr id="0" name="Picture 1684915597"/>
-                  <pic:cNvPicPr>
-                    <a:picLocks noChangeAspect="1" noChangeArrowheads="1"/>
-                  </pic:cNvPicPr>
-                </pic:nvPicPr>
-                <pic:blipFill>
-                  <a:blip r:embed="rId1">
-                    <a:extLst>
-                      <a:ext uri="{28A0092B-C50C-407E-A947-70E740481C1C}">
-                        <a14:useLocalDpi xmlns:a14="http://schemas.microsoft.com/office/drawing/2010/main" val="0"/>
-                      </a:ext>
-                    </a:extLst>
-                  </a:blip>
-                  <a:srcRect/>
-                  <a:stretch>
-                    <a:fillRect/>
-                  </a:stretch>
-                </pic:blipFill>
-                <pic:spPr bwMode="auto">
-                  <a:xfrm>
-                    <a:off x="0" y="0"/>
-                    <a:ext cx="1905000" cy="335280"/>
-                  </a:xfrm>
-                  <a:prstGeom prst="rect">
-                    <a:avLst/>
-                  </a:prstGeom>
-                  <a:noFill/>
-                  <a:ln>
-                    <a:noFill/>
-                  </a:ln>
-                </pic:spPr>
-              </pic:pic>
-            </a:graphicData>
-          </a:graphic>
-        </wp:inline>
-      </w:drawing>
-    </w:r>
-  </w:p>
-</w:hdr>
+<ns0:hdr xmlns:ns0="http://schemas.openxmlformats.org/wordprocessingml/2006/main" xmlns:ns1="http://schemas.openxmlformats.org/markup-compatibility/2006" xmlns:ns2="http://schemas.microsoft.com/office/word/2010/wordml" xmlns:ns3="http://schemas.openxmlformats.org/drawingml/2006/wordprocessingDrawing" xmlns:ns4="http://schemas.microsoft.com/office/word/2010/wordprocessingDrawing" xmlns:ns5="http://schemas.openxmlformats.org/drawingml/2006/main" xmlns:ns6="http://schemas.openxmlformats.org/drawingml/2006/picture" xmlns:ns7="http://schemas.openxmlformats.org/officeDocument/2006/relationships" xmlns:ns8="http://schemas.microsoft.com/office/drawing/2010/main" ns1:Ignorable="w14 w15 w16se w16cid w16 w16cex w16sdtdh w16sdtfl w16du wp14">
+  <ns0:p ns2:paraId="4A4B744E" ns2:textId="3F5C4C81" ns0:rsidR="00FB200F" ns0:rsidRPr="00FB200F" ns0:rsidRDefault="00C55180" ns0:rsidP="00B53E80">
+    <ns0:pPr>
+      <ns0:pStyle ns0:val="Header"/>
+      <ns0:tabs>
+        <ns0:tab ns0:pos="10466" ns0:val="right"/>
+      </ns0:tabs>
+      <ns0:rPr>
+        <ns0:rFonts ns0:ascii="Times New Roman" ns0:hAnsi="Times New Roman" ns0:cs="Times New Roman"/>
+        <ns0:b/>
+        <ns0:sz ns0:val="28"/>
+        <ns0:szCs ns0:val="28"/>
+      </ns0:rPr>
+    </ns0:pPr>
+    <ns0:r>
+      <ns0:rPr>
+        <ns0:rFonts ns0:ascii="Times New Roman" ns0:hAnsi="Times New Roman" ns0:cs="Times New Roman"/>
+        <ns0:b/>
+        <ns0:sz ns0:val="28"/>
+        <ns0:szCs ns0:val="28"/>
+      </ns0:rPr>
+      <ns0:t xml:space="preserve"/>
+    </ns0:r>
+    <ns0:r>
+      <ns0:tab/>
+    </ns0:r>
+    <ns0:r>
+      <ns0:rPr>
+        <ns0:noProof/>
+      </ns0:rPr>
+      <ns0:drawing>
+        <ns3:inline distT="0" distB="0" distL="0" distR="0" ns4:anchorId="2DE2E8FD" ns4:editId="7510F1D2">
+          <ns3:extent cx="1905000" cy="346970"/>
+          <ns3:effectExtent l="0" t="0" r="0" b="7620"/>
+          <ns3:docPr id="848381399" name="Picture 1"/>
+          <ns3:cNvGraphicFramePr>
+            <ns5:graphicFrameLocks noChangeAspect="1"/>
+          </ns3:cNvGraphicFramePr>
+          <ns5:graphic>
+            <ns5:graphicData uri="http://schemas.openxmlformats.org/drawingml/2006/picture">
+              <ns6:pic>
+                <ns6:nvPicPr>
+                  <ns6:cNvPr id="0" name="Picture 1684915597"/>
+                  <ns6:cNvPicPr>
+                    <ns5:picLocks noChangeAspect="1" noChangeArrowheads="1"/>
+                  </ns6:cNvPicPr>
+                </ns6:nvPicPr>
+                <ns6:blipFill>
+                  <ns5:blip ns7:embed="rId1">
+                    <ns5:extLst>
+                      <ns5:ext uri="{28A0092B-C50C-407E-A947-70E740481C1C}">
+                        <ns8:useLocalDpi val="0"/>
+                      </ns5:ext>
+                    </ns5:extLst>
+                  </ns5:blip>
+                  <ns5:srcRect/>
+                  <ns5:stretch>
+                    <ns5:fillRect/>
+                  </ns5:stretch>
+                </ns6:blipFill>
+                <ns6:spPr bwMode="auto">
+                  <ns5:xfrm>
+                    <ns5:off x="0" y="0"/>
+                    <ns5:ext cx="1905000" cy="346970"/>
+                  </ns5:xfrm>
+                  <ns5:prstGeom prst="rect">
+                    <ns5:avLst/>
+                  </ns5:prstGeom>
+                  <ns5:noFill/>
+                  <ns5:ln>
+                    <ns5:noFill/>
+                  </ns5:ln>
+                </ns6:spPr>
+              </ns6:pic>
+            </ns5:graphicData>
+          </ns5:graphic>
+        </ns3:inline>
+      </ns0:drawing>
+    </ns0:r>
+  </ns0:p>
+</ns0:hdr>
 </file>
 
 <file path=word/numbering.xml><?xml version="1.0" encoding="utf-8"?>

</xml_diff>